<commit_message>
test: add DOCX image preview coverage
</commit_message>
<xml_diff>
--- a/test/fixtures/files/msword.docx
+++ b/test/fixtures/files/msword.docx
@@ -123,7 +123,7 @@
         <w:pStyle w:val="Normal"/>
         <w:numPr>
           <w:ilvl w:val="0"/>
-          <w:numId w:val="2"/>
+          <w:numId w:val="1"/>
         </w:numPr>
         <w:bidi w:val="0"/>
         <w:jc w:val="start"/>
@@ -139,7 +139,7 @@
         <w:pStyle w:val="Normal"/>
         <w:numPr>
           <w:ilvl w:val="0"/>
-          <w:numId w:val="2"/>
+          <w:numId w:val="1"/>
         </w:numPr>
         <w:bidi w:val="0"/>
         <w:jc w:val="start"/>
@@ -155,7 +155,7 @@
         <w:pStyle w:val="Normal"/>
         <w:numPr>
           <w:ilvl w:val="0"/>
-          <w:numId w:val="2"/>
+          <w:numId w:val="1"/>
         </w:numPr>
         <w:bidi w:val="0"/>
         <w:jc w:val="start"/>
@@ -171,7 +171,7 @@
         <w:pStyle w:val="Normal"/>
         <w:numPr>
           <w:ilvl w:val="0"/>
-          <w:numId w:val="2"/>
+          <w:numId w:val="1"/>
         </w:numPr>
         <w:bidi w:val="0"/>
         <w:jc w:val="start"/>
@@ -187,7 +187,7 @@
         <w:pStyle w:val="Normal"/>
         <w:numPr>
           <w:ilvl w:val="0"/>
-          <w:numId w:val="2"/>
+          <w:numId w:val="1"/>
         </w:numPr>
         <w:bidi w:val="0"/>
         <w:jc w:val="start"/>
@@ -203,7 +203,7 @@
         <w:pStyle w:val="Normal"/>
         <w:numPr>
           <w:ilvl w:val="0"/>
-          <w:numId w:val="2"/>
+          <w:numId w:val="1"/>
         </w:numPr>
         <w:bidi w:val="0"/>
         <w:jc w:val="start"/>
@@ -219,7 +219,7 @@
         <w:pStyle w:val="Normal"/>
         <w:numPr>
           <w:ilvl w:val="0"/>
-          <w:numId w:val="2"/>
+          <w:numId w:val="1"/>
         </w:numPr>
         <w:bidi w:val="0"/>
         <w:jc w:val="start"/>
@@ -235,7 +235,7 @@
         <w:pStyle w:val="Normal"/>
         <w:numPr>
           <w:ilvl w:val="0"/>
-          <w:numId w:val="2"/>
+          <w:numId w:val="1"/>
         </w:numPr>
         <w:bidi w:val="0"/>
         <w:jc w:val="start"/>
@@ -251,7 +251,7 @@
         <w:pStyle w:val="Normal"/>
         <w:numPr>
           <w:ilvl w:val="0"/>
-          <w:numId w:val="2"/>
+          <w:numId w:val="1"/>
         </w:numPr>
         <w:bidi w:val="0"/>
         <w:jc w:val="start"/>
@@ -267,7 +267,7 @@
         <w:pStyle w:val="Normal"/>
         <w:numPr>
           <w:ilvl w:val="0"/>
-          <w:numId w:val="2"/>
+          <w:numId w:val="1"/>
         </w:numPr>
         <w:bidi w:val="0"/>
         <w:jc w:val="start"/>
@@ -283,7 +283,7 @@
         <w:pStyle w:val="Normal"/>
         <w:numPr>
           <w:ilvl w:val="0"/>
-          <w:numId w:val="2"/>
+          <w:numId w:val="1"/>
         </w:numPr>
         <w:bidi w:val="0"/>
         <w:jc w:val="start"/>
@@ -299,7 +299,7 @@
         <w:pStyle w:val="Normal"/>
         <w:numPr>
           <w:ilvl w:val="0"/>
-          <w:numId w:val="2"/>
+          <w:numId w:val="1"/>
         </w:numPr>
         <w:bidi w:val="0"/>
         <w:jc w:val="start"/>
@@ -315,7 +315,7 @@
         <w:pStyle w:val="Normal"/>
         <w:numPr>
           <w:ilvl w:val="0"/>
-          <w:numId w:val="2"/>
+          <w:numId w:val="1"/>
         </w:numPr>
         <w:bidi w:val="0"/>
         <w:jc w:val="start"/>
@@ -331,7 +331,7 @@
         <w:pStyle w:val="Normal"/>
         <w:numPr>
           <w:ilvl w:val="0"/>
-          <w:numId w:val="2"/>
+          <w:numId w:val="1"/>
         </w:numPr>
         <w:bidi w:val="0"/>
         <w:jc w:val="start"/>
@@ -347,7 +347,7 @@
         <w:pStyle w:val="Normal"/>
         <w:numPr>
           <w:ilvl w:val="0"/>
-          <w:numId w:val="2"/>
+          <w:numId w:val="1"/>
         </w:numPr>
         <w:bidi w:val="0"/>
         <w:jc w:val="start"/>
@@ -363,7 +363,7 @@
         <w:pStyle w:val="Normal"/>
         <w:numPr>
           <w:ilvl w:val="0"/>
-          <w:numId w:val="2"/>
+          <w:numId w:val="1"/>
         </w:numPr>
         <w:bidi w:val="0"/>
         <w:jc w:val="start"/>
@@ -394,6 +394,52 @@
       </w:pPr>
       <w:r>
         <w:rPr/>
+        <w:drawing>
+          <wp:anchor distT="0" distB="0" distL="0" distR="0" simplePos="0" relativeHeight="2" behindDoc="0" locked="0" layoutInCell="0" allowOverlap="1">
+            <wp:simplePos x="0" y="0"/>
+            <wp:positionH relativeFrom="column">
+              <wp:align>center</wp:align>
+            </wp:positionH>
+            <wp:positionV relativeFrom="paragraph">
+              <wp:posOffset>635</wp:posOffset>
+            </wp:positionV>
+            <wp:extent cx="1504315" cy="1504315"/>
+            <wp:effectExtent l="0" t="0" r="0" b="0"/>
+            <wp:wrapSquare wrapText="largest"/>
+            <wp:docPr id="1" name="Bild1"/>
+            <wp:cNvGraphicFramePr>
+              <a:graphicFrameLocks xmlns:a="http://schemas.openxmlformats.org/drawingml/2006/main" noChangeAspect="1"/>
+            </wp:cNvGraphicFramePr>
+            <a:graphic xmlns:a="http://schemas.openxmlformats.org/drawingml/2006/main">
+              <a:graphicData uri="http://schemas.openxmlformats.org/drawingml/2006/picture">
+                <pic:pic xmlns:pic="http://schemas.openxmlformats.org/drawingml/2006/picture">
+                  <pic:nvPicPr>
+                    <pic:cNvPr id="1" name="Bild1"/>
+                    <pic:cNvPicPr>
+                      <a:picLocks noChangeAspect="1" noChangeArrowheads="1"/>
+                    </pic:cNvPicPr>
+                  </pic:nvPicPr>
+                  <pic:blipFill>
+                    <a:blip r:embed="rId2"/>
+                    <a:stretch>
+                      <a:fillRect/>
+                    </a:stretch>
+                  </pic:blipFill>
+                  <pic:spPr bwMode="auto">
+                    <a:xfrm>
+                      <a:off x="0" y="0"/>
+                      <a:ext cx="1504315" cy="1504315"/>
+                    </a:xfrm>
+                    <a:prstGeom prst="rect">
+                      <a:avLst/>
+                    </a:prstGeom>
+                    <a:noFill/>
+                  </pic:spPr>
+                </pic:pic>
+              </a:graphicData>
+            </a:graphic>
+          </wp:anchor>
+        </w:drawing>
       </w:r>
     </w:p>
     <w:sectPr>
@@ -403,6 +449,7 @@
       <w:pgNumType w:fmt="decimal"/>
       <w:formProt w:val="false"/>
       <w:textDirection w:val="lrTb"/>
+      <w:docGrid w:type="default" w:linePitch="100" w:charSpace="0"/>
     </w:sectPr>
   </w:body>
 </w:document>
@@ -413,33 +460,142 @@
   <w:abstractNum w:abstractNumId="1">
     <w:lvl w:ilvl="0">
       <w:start w:val="1"/>
-      <w:numFmt w:val="none"/>
-      <w:pStyle w:val="Heading1"/>
-      <w:suff w:val="nothing"/>
-      <w:lvlText w:val=""/>
-      <w:lvlJc w:val="start"/>
-      <w:pPr>
-        <w:tabs>
-          <w:tab w:val="num" w:pos="0"/>
-        </w:tabs>
-        <w:ind w:start="0" w:hanging="0"/>
-      </w:pPr>
+      <w:numFmt w:val="bullet"/>
+      <w:lvlText w:val=""/>
+      <w:lvlJc w:val="start"/>
+      <w:pPr>
+        <w:tabs>
+          <w:tab w:val="num" w:pos="720"/>
+        </w:tabs>
+        <w:ind w:start="720" w:hanging="360"/>
+      </w:pPr>
+      <w:rPr>
+        <w:rFonts w:ascii="Symbol" w:hAnsi="Symbol" w:cs="Symbol" w:hint="default"/>
+      </w:rPr>
     </w:lvl>
     <w:lvl w:ilvl="1">
       <w:start w:val="1"/>
-      <w:numFmt w:val="none"/>
-      <w:pStyle w:val="Heading2"/>
-      <w:suff w:val="nothing"/>
-      <w:lvlText w:val=""/>
-      <w:lvlJc w:val="start"/>
-      <w:pPr>
-        <w:tabs>
-          <w:tab w:val="num" w:pos="0"/>
-        </w:tabs>
-        <w:ind w:start="0" w:hanging="0"/>
-      </w:pPr>
+      <w:numFmt w:val="bullet"/>
+      <w:lvlText w:val="◦"/>
+      <w:lvlJc w:val="start"/>
+      <w:pPr>
+        <w:tabs>
+          <w:tab w:val="num" w:pos="1080"/>
+        </w:tabs>
+        <w:ind w:start="1080" w:hanging="360"/>
+      </w:pPr>
+      <w:rPr>
+        <w:rFonts w:ascii="OpenSymbol" w:hAnsi="OpenSymbol" w:cs="OpenSymbol" w:hint="default"/>
+      </w:rPr>
     </w:lvl>
     <w:lvl w:ilvl="2">
+      <w:start w:val="1"/>
+      <w:numFmt w:val="bullet"/>
+      <w:lvlText w:val="▪"/>
+      <w:lvlJc w:val="start"/>
+      <w:pPr>
+        <w:tabs>
+          <w:tab w:val="num" w:pos="1440"/>
+        </w:tabs>
+        <w:ind w:start="1440" w:hanging="360"/>
+      </w:pPr>
+      <w:rPr>
+        <w:rFonts w:ascii="OpenSymbol" w:hAnsi="OpenSymbol" w:cs="OpenSymbol" w:hint="default"/>
+      </w:rPr>
+    </w:lvl>
+    <w:lvl w:ilvl="3">
+      <w:start w:val="1"/>
+      <w:numFmt w:val="bullet"/>
+      <w:lvlText w:val=""/>
+      <w:lvlJc w:val="start"/>
+      <w:pPr>
+        <w:tabs>
+          <w:tab w:val="num" w:pos="1800"/>
+        </w:tabs>
+        <w:ind w:start="1800" w:hanging="360"/>
+      </w:pPr>
+      <w:rPr>
+        <w:rFonts w:ascii="Symbol" w:hAnsi="Symbol" w:cs="Symbol" w:hint="default"/>
+      </w:rPr>
+    </w:lvl>
+    <w:lvl w:ilvl="4">
+      <w:start w:val="1"/>
+      <w:numFmt w:val="bullet"/>
+      <w:lvlText w:val="◦"/>
+      <w:lvlJc w:val="start"/>
+      <w:pPr>
+        <w:tabs>
+          <w:tab w:val="num" w:pos="2160"/>
+        </w:tabs>
+        <w:ind w:start="2160" w:hanging="360"/>
+      </w:pPr>
+      <w:rPr>
+        <w:rFonts w:ascii="OpenSymbol" w:hAnsi="OpenSymbol" w:cs="OpenSymbol" w:hint="default"/>
+      </w:rPr>
+    </w:lvl>
+    <w:lvl w:ilvl="5">
+      <w:start w:val="1"/>
+      <w:numFmt w:val="bullet"/>
+      <w:lvlText w:val="▪"/>
+      <w:lvlJc w:val="start"/>
+      <w:pPr>
+        <w:tabs>
+          <w:tab w:val="num" w:pos="2520"/>
+        </w:tabs>
+        <w:ind w:start="2520" w:hanging="360"/>
+      </w:pPr>
+      <w:rPr>
+        <w:rFonts w:ascii="OpenSymbol" w:hAnsi="OpenSymbol" w:cs="OpenSymbol" w:hint="default"/>
+      </w:rPr>
+    </w:lvl>
+    <w:lvl w:ilvl="6">
+      <w:start w:val="1"/>
+      <w:numFmt w:val="bullet"/>
+      <w:lvlText w:val=""/>
+      <w:lvlJc w:val="start"/>
+      <w:pPr>
+        <w:tabs>
+          <w:tab w:val="num" w:pos="2880"/>
+        </w:tabs>
+        <w:ind w:start="2880" w:hanging="360"/>
+      </w:pPr>
+      <w:rPr>
+        <w:rFonts w:ascii="Symbol" w:hAnsi="Symbol" w:cs="Symbol" w:hint="default"/>
+      </w:rPr>
+    </w:lvl>
+    <w:lvl w:ilvl="7">
+      <w:start w:val="1"/>
+      <w:numFmt w:val="bullet"/>
+      <w:lvlText w:val="◦"/>
+      <w:lvlJc w:val="start"/>
+      <w:pPr>
+        <w:tabs>
+          <w:tab w:val="num" w:pos="3240"/>
+        </w:tabs>
+        <w:ind w:start="3240" w:hanging="360"/>
+      </w:pPr>
+      <w:rPr>
+        <w:rFonts w:ascii="OpenSymbol" w:hAnsi="OpenSymbol" w:cs="OpenSymbol" w:hint="default"/>
+      </w:rPr>
+    </w:lvl>
+    <w:lvl w:ilvl="8">
+      <w:start w:val="1"/>
+      <w:numFmt w:val="bullet"/>
+      <w:lvlText w:val="▪"/>
+      <w:lvlJc w:val="start"/>
+      <w:pPr>
+        <w:tabs>
+          <w:tab w:val="num" w:pos="3600"/>
+        </w:tabs>
+        <w:ind w:start="3600" w:hanging="360"/>
+      </w:pPr>
+      <w:rPr>
+        <w:rFonts w:ascii="OpenSymbol" w:hAnsi="OpenSymbol" w:cs="OpenSymbol" w:hint="default"/>
+      </w:rPr>
+    </w:lvl>
+  </w:abstractNum>
+  <w:abstractNum w:abstractNumId="2">
+    <w:lvl w:ilvl="0">
       <w:start w:val="1"/>
       <w:numFmt w:val="none"/>
       <w:suff w:val="nothing"/>
@@ -452,7 +608,7 @@
         <w:ind w:start="0" w:hanging="0"/>
       </w:pPr>
     </w:lvl>
-    <w:lvl w:ilvl="3">
+    <w:lvl w:ilvl="1">
       <w:start w:val="1"/>
       <w:numFmt w:val="none"/>
       <w:suff w:val="nothing"/>
@@ -465,7 +621,7 @@
         <w:ind w:start="0" w:hanging="0"/>
       </w:pPr>
     </w:lvl>
-    <w:lvl w:ilvl="4">
+    <w:lvl w:ilvl="2">
       <w:start w:val="1"/>
       <w:numFmt w:val="none"/>
       <w:suff w:val="nothing"/>
@@ -478,7 +634,7 @@
         <w:ind w:start="0" w:hanging="0"/>
       </w:pPr>
     </w:lvl>
-    <w:lvl w:ilvl="5">
+    <w:lvl w:ilvl="3">
       <w:start w:val="1"/>
       <w:numFmt w:val="none"/>
       <w:suff w:val="nothing"/>
@@ -491,7 +647,7 @@
         <w:ind w:start="0" w:hanging="0"/>
       </w:pPr>
     </w:lvl>
-    <w:lvl w:ilvl="6">
+    <w:lvl w:ilvl="4">
       <w:start w:val="1"/>
       <w:numFmt w:val="none"/>
       <w:suff w:val="nothing"/>
@@ -504,7 +660,7 @@
         <w:ind w:start="0" w:hanging="0"/>
       </w:pPr>
     </w:lvl>
-    <w:lvl w:ilvl="7">
+    <w:lvl w:ilvl="5">
       <w:start w:val="1"/>
       <w:numFmt w:val="none"/>
       <w:suff w:val="nothing"/>
@@ -517,7 +673,7 @@
         <w:ind w:start="0" w:hanging="0"/>
       </w:pPr>
     </w:lvl>
-    <w:lvl w:ilvl="8">
+    <w:lvl w:ilvl="6">
       <w:start w:val="1"/>
       <w:numFmt w:val="none"/>
       <w:suff w:val="nothing"/>
@@ -530,142 +686,31 @@
         <w:ind w:start="0" w:hanging="0"/>
       </w:pPr>
     </w:lvl>
-  </w:abstractNum>
-  <w:abstractNum w:abstractNumId="2">
-    <w:lvl w:ilvl="0">
-      <w:start w:val="1"/>
-      <w:numFmt w:val="bullet"/>
-      <w:lvlText w:val=""/>
-      <w:lvlJc w:val="start"/>
-      <w:pPr>
-        <w:tabs>
-          <w:tab w:val="num" w:pos="720"/>
-        </w:tabs>
-        <w:ind w:start="720" w:hanging="360"/>
-      </w:pPr>
-      <w:rPr>
-        <w:rFonts w:ascii="Symbol" w:hAnsi="Symbol" w:cs="Symbol" w:hint="default"/>
-      </w:rPr>
-    </w:lvl>
-    <w:lvl w:ilvl="1">
-      <w:start w:val="1"/>
-      <w:numFmt w:val="bullet"/>
-      <w:lvlText w:val="◦"/>
-      <w:lvlJc w:val="start"/>
-      <w:pPr>
-        <w:tabs>
-          <w:tab w:val="num" w:pos="1080"/>
-        </w:tabs>
-        <w:ind w:start="1080" w:hanging="360"/>
-      </w:pPr>
-      <w:rPr>
-        <w:rFonts w:ascii="OpenSymbol" w:hAnsi="OpenSymbol" w:cs="OpenSymbol" w:hint="default"/>
-      </w:rPr>
-    </w:lvl>
-    <w:lvl w:ilvl="2">
-      <w:start w:val="1"/>
-      <w:numFmt w:val="bullet"/>
-      <w:lvlText w:val="▪"/>
-      <w:lvlJc w:val="start"/>
-      <w:pPr>
-        <w:tabs>
-          <w:tab w:val="num" w:pos="1440"/>
-        </w:tabs>
-        <w:ind w:start="1440" w:hanging="360"/>
-      </w:pPr>
-      <w:rPr>
-        <w:rFonts w:ascii="OpenSymbol" w:hAnsi="OpenSymbol" w:cs="OpenSymbol" w:hint="default"/>
-      </w:rPr>
-    </w:lvl>
-    <w:lvl w:ilvl="3">
-      <w:start w:val="1"/>
-      <w:numFmt w:val="bullet"/>
-      <w:lvlText w:val=""/>
-      <w:lvlJc w:val="start"/>
-      <w:pPr>
-        <w:tabs>
-          <w:tab w:val="num" w:pos="1800"/>
-        </w:tabs>
-        <w:ind w:start="1800" w:hanging="360"/>
-      </w:pPr>
-      <w:rPr>
-        <w:rFonts w:ascii="Symbol" w:hAnsi="Symbol" w:cs="Symbol" w:hint="default"/>
-      </w:rPr>
-    </w:lvl>
-    <w:lvl w:ilvl="4">
-      <w:start w:val="1"/>
-      <w:numFmt w:val="bullet"/>
-      <w:lvlText w:val="◦"/>
-      <w:lvlJc w:val="start"/>
-      <w:pPr>
-        <w:tabs>
-          <w:tab w:val="num" w:pos="2160"/>
-        </w:tabs>
-        <w:ind w:start="2160" w:hanging="360"/>
-      </w:pPr>
-      <w:rPr>
-        <w:rFonts w:ascii="OpenSymbol" w:hAnsi="OpenSymbol" w:cs="OpenSymbol" w:hint="default"/>
-      </w:rPr>
-    </w:lvl>
-    <w:lvl w:ilvl="5">
-      <w:start w:val="1"/>
-      <w:numFmt w:val="bullet"/>
-      <w:lvlText w:val="▪"/>
-      <w:lvlJc w:val="start"/>
-      <w:pPr>
-        <w:tabs>
-          <w:tab w:val="num" w:pos="2520"/>
-        </w:tabs>
-        <w:ind w:start="2520" w:hanging="360"/>
-      </w:pPr>
-      <w:rPr>
-        <w:rFonts w:ascii="OpenSymbol" w:hAnsi="OpenSymbol" w:cs="OpenSymbol" w:hint="default"/>
-      </w:rPr>
-    </w:lvl>
-    <w:lvl w:ilvl="6">
-      <w:start w:val="1"/>
-      <w:numFmt w:val="bullet"/>
-      <w:lvlText w:val=""/>
-      <w:lvlJc w:val="start"/>
-      <w:pPr>
-        <w:tabs>
-          <w:tab w:val="num" w:pos="2880"/>
-        </w:tabs>
-        <w:ind w:start="2880" w:hanging="360"/>
-      </w:pPr>
-      <w:rPr>
-        <w:rFonts w:ascii="Symbol" w:hAnsi="Symbol" w:cs="Symbol" w:hint="default"/>
-      </w:rPr>
-    </w:lvl>
     <w:lvl w:ilvl="7">
       <w:start w:val="1"/>
-      <w:numFmt w:val="bullet"/>
-      <w:lvlText w:val="◦"/>
-      <w:lvlJc w:val="start"/>
-      <w:pPr>
-        <w:tabs>
-          <w:tab w:val="num" w:pos="3240"/>
-        </w:tabs>
-        <w:ind w:start="3240" w:hanging="360"/>
-      </w:pPr>
-      <w:rPr>
-        <w:rFonts w:ascii="OpenSymbol" w:hAnsi="OpenSymbol" w:cs="OpenSymbol" w:hint="default"/>
-      </w:rPr>
+      <w:numFmt w:val="none"/>
+      <w:suff w:val="nothing"/>
+      <w:lvlText w:val=""/>
+      <w:lvlJc w:val="start"/>
+      <w:pPr>
+        <w:tabs>
+          <w:tab w:val="num" w:pos="0"/>
+        </w:tabs>
+        <w:ind w:start="0" w:hanging="0"/>
+      </w:pPr>
     </w:lvl>
     <w:lvl w:ilvl="8">
       <w:start w:val="1"/>
-      <w:numFmt w:val="bullet"/>
-      <w:lvlText w:val="▪"/>
-      <w:lvlJc w:val="start"/>
-      <w:pPr>
-        <w:tabs>
-          <w:tab w:val="num" w:pos="3600"/>
-        </w:tabs>
-        <w:ind w:start="3600" w:hanging="360"/>
-      </w:pPr>
-      <w:rPr>
-        <w:rFonts w:ascii="OpenSymbol" w:hAnsi="OpenSymbol" w:cs="OpenSymbol" w:hint="default"/>
-      </w:rPr>
+      <w:numFmt w:val="none"/>
+      <w:suff w:val="nothing"/>
+      <w:lvlText w:val=""/>
+      <w:lvlJc w:val="start"/>
+      <w:pPr>
+        <w:tabs>
+          <w:tab w:val="num" w:pos="0"/>
+        </w:tabs>
+        <w:ind w:start="0" w:hanging="0"/>
+      </w:pPr>
     </w:lvl>
   </w:abstractNum>
   <w:num w:numId="1">
@@ -691,7 +736,6 @@
     </w:rPrDefault>
     <w:pPrDefault>
       <w:pPr>
-        <w:widowControl/>
         <w:suppressAutoHyphens w:val="true"/>
       </w:pPr>
     </w:pPrDefault>
@@ -701,7 +745,10 @@
     <w:qFormat/>
     <w:pPr>
       <w:widowControl/>
+      <w:suppressAutoHyphens w:val="true"/>
       <w:bidi w:val="0"/>
+      <w:spacing w:before="0" w:after="0"/>
+      <w:jc w:val="start"/>
     </w:pPr>
     <w:rPr>
       <w:rFonts w:ascii="Liberation Serif" w:hAnsi="Liberation Serif" w:eastAsia="游明朝体" w:cs="Lucida Sans"/>
@@ -714,7 +761,7 @@
   </w:style>
   <w:style w:type="paragraph" w:styleId="Heading1">
     <w:name w:val="heading 1"/>
-    <w:basedOn w:val="Heading"/>
+    <w:basedOn w:val="berschrift"/>
     <w:next w:val="BodyText"/>
     <w:qFormat/>
     <w:pPr>
@@ -731,7 +778,7 @@
   </w:style>
   <w:style w:type="paragraph" w:styleId="Heading2">
     <w:name w:val="heading 2"/>
-    <w:basedOn w:val="Heading"/>
+    <w:basedOn w:val="berschrift"/>
     <w:next w:val="BodyText"/>
     <w:qFormat/>
     <w:pPr>
@@ -768,8 +815,8 @@
       <w:u w:val="single"/>
     </w:rPr>
   </w:style>
-  <w:style w:type="paragraph" w:styleId="Heading">
-    <w:name w:val="Heading"/>
+  <w:style w:type="paragraph" w:styleId="berschrift">
+    <w:name w:val="Überschrift"/>
     <w:basedOn w:val="Normal"/>
     <w:next w:val="BodyText"/>
     <w:qFormat/>
@@ -815,8 +862,8 @@
       <w:szCs w:val="24"/>
     </w:rPr>
   </w:style>
-  <w:style w:type="paragraph" w:styleId="Index">
-    <w:name w:val="Index"/>
+  <w:style w:type="paragraph" w:styleId="Verzeichnis">
+    <w:name w:val="Verzeichnis"/>
     <w:basedOn w:val="Normal"/>
     <w:qFormat/>
     <w:pPr>
@@ -828,7 +875,7 @@
   </w:style>
   <w:style w:type="paragraph" w:styleId="Title">
     <w:name w:val="Title"/>
-    <w:basedOn w:val="Heading"/>
+    <w:basedOn w:val="berschrift"/>
     <w:next w:val="BodyText"/>
     <w:qFormat/>
     <w:pPr>

</xml_diff>